<commit_message>
fix: restore contract template placeholders after bad patch
Co-authored-by: Cursor <cursoragent@cursor.com>
</commit_message>
<xml_diff>
--- a/templates/contracts/atlantic-subcontract.docx
+++ b/templates/contracts/atlantic-subcontract.docx
@@ -24,7 +24,7 @@
           <w:b/>
           <w:bCs/>
         </w:rPr>
-        <w:t>{PLACEHOLDER}</w:t>
+        <w:t>{contract_no}</w:t>
       </w:r>
     </w:p>
     <w:p>
@@ -154,7 +154,7 @@
         <w:rPr>
           <w:rFonts w:ascii="Times New Roman" w:hAnsi="Times New Roman" w:cs="Times New Roman"/>
         </w:rPr>
-        <w:t>{PLACEHOLDER}</w:t>
+        <w:t>{client_name}</w:t>
       </w:r>
       <w:r>
         <w:rPr>
@@ -166,7 +166,7 @@
         <w:rPr>
           <w:rFonts w:ascii="Times New Roman" w:hAnsi="Times New Roman" w:cs="Times New Roman"/>
         </w:rPr>
-        <w:t>{PLACEHOLDER}</w:t>
+        <w:t>{client_iin}</w:t>
       </w:r>
       <w:r>
         <w:rPr>
@@ -178,7 +178,7 @@
         <w:rPr>
           <w:rFonts w:ascii="Times New Roman" w:hAnsi="Times New Roman" w:cs="Times New Roman"/>
         </w:rPr>
-        <w:t>{PLACEHOLDER}</w:t>
+        <w:t>{client_residence_address}</w:t>
       </w:r>
       <w:r>
         <w:rPr>
@@ -228,7 +228,7 @@
         <w:rPr>
           <w:rFonts w:ascii="Times New Roman" w:hAnsi="Times New Roman" w:cs="Times New Roman"/>
         </w:rPr>
-        <w:t>{PLACEHOLDER}</w:t>
+        <w:t>{installation_address}</w:t>
       </w:r>
       <w:r>
         <w:rPr>
@@ -1280,7 +1280,7 @@
                 <w:rFonts w:ascii="Times New Roman" w:hAnsi="Times New Roman" w:cs="Times New Roman"/>
                 <w:lang w:val="en-US"/>
               </w:rPr>
-              <w:t>{PLACEHOLDER}</w:t>
+              <w:t>{client_name}</w:t>
             </w:r>
           </w:p>
           <w:p>
@@ -1310,7 +1310,7 @@
                 <w:rFonts w:ascii="Times New Roman" w:hAnsi="Times New Roman" w:cs="Times New Roman"/>
                 <w:lang w:val="en-US"/>
               </w:rPr>
-              <w:t>{PLACEHOLDER}</w:t>
+              <w:t>{client_iin}</w:t>
             </w:r>
           </w:p>
           <w:p>
@@ -1340,7 +1340,7 @@
                 <w:rFonts w:ascii="Times New Roman" w:hAnsi="Times New Roman" w:cs="Times New Roman"/>
                 <w:lang w:val="en-US"/>
               </w:rPr>
-              <w:t>{PLACEHOLDER}</w:t>
+              <w:t>{client_residence_address}</w:t>
             </w:r>
           </w:p>
           <w:p>
@@ -1370,7 +1370,7 @@
                 <w:rFonts w:ascii="Times New Roman" w:hAnsi="Times New Roman" w:cs="Times New Roman"/>
                 <w:lang w:val="en-US"/>
               </w:rPr>
-              <w:t>{PLACEHOLDER}</w:t>
+              <w:t>{client_phone}</w:t>
             </w:r>
           </w:p>
           <w:p>
@@ -1535,7 +1535,7 @@
           <w:b/>
           <w:bCs/>
         </w:rPr>
-        <w:t>{PLACEHOLDER}</w:t>
+        <w:t>{contract_no}</w:t>
       </w:r>
       <w:r>
         <w:rPr>
@@ -1549,7 +1549,7 @@
           <w:rFonts w:ascii="Times New Roman" w:hAnsi="Times New Roman" w:cs="Times New Roman"/>
           <w:b/>
         </w:rPr>
-        <w:t>{PLACEHOLDER}</w:t>
+        <w:t>{contract_date_short}</w:t>
       </w:r>
       <w:r>
         <w:rPr>
@@ -1883,7 +1883,7 @@
               <w:rPr>
                 <w:rFonts w:ascii="Times New Roman" w:hAnsi="Times New Roman" w:cs="Times New Roman"/>
               </w:rPr>
-              <w:t>{PLACEHOLDER}</w:t>
+              <w:t>{#work_items}{work_no}</w:t>
             </w:r>
           </w:p>
         </w:tc>
@@ -1903,7 +1903,7 @@
               <w:rPr>
                 <w:rFonts w:ascii="Times New Roman" w:hAnsi="Times New Roman" w:cs="Times New Roman"/>
               </w:rPr>
-              <w:t>{PLACEHOLDER}</w:t>
+              <w:t>{work_name}</w:t>
             </w:r>
           </w:p>
         </w:tc>
@@ -1923,7 +1923,7 @@
               <w:rPr>
                 <w:rFonts w:ascii="Times New Roman" w:hAnsi="Times New Roman" w:cs="Times New Roman"/>
               </w:rPr>
-              <w:t>{PLACEHOLDER}</w:t>
+              <w:t>{work_unit}</w:t>
             </w:r>
           </w:p>
         </w:tc>
@@ -1943,7 +1943,7 @@
               <w:rPr>
                 <w:rFonts w:ascii="Times New Roman" w:hAnsi="Times New Roman" w:cs="Times New Roman"/>
               </w:rPr>
-              <w:t>{PLACEHOLDER}</w:t>
+              <w:t>{work_qty}</w:t>
             </w:r>
           </w:p>
         </w:tc>
@@ -1963,7 +1963,7 @@
               <w:rPr>
                 <w:rFonts w:ascii="Times New Roman" w:hAnsi="Times New Roman" w:cs="Times New Roman"/>
               </w:rPr>
-              <w:t>{PLACEHOLDER}</w:t>
+              <w:t>{work_unit_price}</w:t>
             </w:r>
           </w:p>
         </w:tc>
@@ -1983,7 +1983,7 @@
               <w:rPr>
                 <w:rFonts w:ascii="Times New Roman" w:hAnsi="Times New Roman" w:cs="Times New Roman"/>
               </w:rPr>
-              <w:t>{PLACEHOLDER}</w:t>
+              <w:t>{work_sum}</w:t>
             </w:r>
           </w:p>
         </w:tc>
@@ -2003,7 +2003,7 @@
               <w:rPr>
                 <w:rFonts w:ascii="Times New Roman" w:hAnsi="Times New Roman" w:cs="Times New Roman"/>
               </w:rPr>
-              <w:t>{PLACEHOLDER}</w:t>
+              <w:t>{work_deadline}</w:t>
             </w:r>
           </w:p>
         </w:tc>
@@ -2023,7 +2023,7 @@
               <w:rPr>
                 <w:rFonts w:ascii="Times New Roman" w:hAnsi="Times New Roman" w:cs="Times New Roman"/>
               </w:rPr>
-              <w:t>{PLACEHOLDER}</w:t>
+              <w:t>{work_payment_terms}</w:t>
             </w:r>
           </w:p>
         </w:tc>
@@ -2043,7 +2043,7 @@
               <w:rPr>
                 <w:rFonts w:ascii="Times New Roman" w:hAnsi="Times New Roman" w:cs="Times New Roman"/>
               </w:rPr>
-              <w:t>{PLACEHOLDER}</w:t>
+              <w:t>{work_warranty}{/work_items}</w:t>
             </w:r>
           </w:p>
         </w:tc>

</xml_diff>